<commit_message>
uprava dat - cas, pridani promennych + vytah z vedeckeho clanku
</commit_message>
<xml_diff>
--- a/textove_soubory/konzultace.docx
+++ b/textove_soubory/konzultace.docx
@@ -1268,7 +1268,15 @@
       </w:r>
       <w:proofErr w:type="gramEnd"/>
       <w:r>
-        <w:t>, duben – červen bez záznamu)</w:t>
+        <w:t xml:space="preserve">, </w:t>
+      </w:r>
+      <w:proofErr w:type="gramStart"/>
+      <w:r>
+        <w:t>duben – červen</w:t>
+      </w:r>
+      <w:proofErr w:type="gramEnd"/>
+      <w:r>
+        <w:t xml:space="preserve"> bez záznamu)</w:t>
       </w:r>
     </w:p>
     <w:p>
@@ -7283,6 +7291,51 @@
         <w:t>Sezónní složky časové řady – odstranění složek a zvýraznění celkového trendu</w:t>
       </w:r>
     </w:p>
+    <w:p>
+      <w:r>
+        <w:br w:type="page"/>
+      </w:r>
+    </w:p>
+    <w:p>
+      <w:r>
+        <w:lastRenderedPageBreak/>
+        <w:br w:type="page"/>
+      </w:r>
+    </w:p>
+    <w:p>
+      <w:pPr>
+        <w:pStyle w:val="Nadpis1"/>
+      </w:pPr>
+      <w:r>
+        <w:lastRenderedPageBreak/>
+        <w:t>Konzultace 9.4</w:t>
+      </w:r>
+    </w:p>
+    <w:p>
+      <w:pPr>
+        <w:pStyle w:val="Odstavecseseznamem"/>
+        <w:numPr>
+          <w:ilvl w:val="0"/>
+          <w:numId w:val="2"/>
+        </w:numPr>
+      </w:pPr>
+      <w:r>
+        <w:t>Indikátor státních svátků</w:t>
+      </w:r>
+    </w:p>
+    <w:p>
+      <w:pPr>
+        <w:pStyle w:val="Odstavecseseznamem"/>
+        <w:numPr>
+          <w:ilvl w:val="0"/>
+          <w:numId w:val="2"/>
+        </w:numPr>
+      </w:pPr>
+      <w:r>
+        <w:t>Změnit časy – letní + zimní</w:t>
+      </w:r>
+    </w:p>
+    <w:p/>
     <w:sectPr>
       <w:pgSz w:w="11906" w:h="16838"/>
       <w:pgMar w:top="1440" w:right="1440" w:bottom="1440" w:left="1440" w:header="708" w:footer="708" w:gutter="0"/>
@@ -8992,6 +9045,7 @@
   <w:style w:type="character" w:default="1" w:styleId="Standardnpsmoodstavce">
     <w:name w:val="Default Paragraph Font"/>
     <w:uiPriority w:val="1"/>
+    <w:semiHidden/>
     <w:unhideWhenUsed/>
   </w:style>
   <w:style w:type="table" w:default="1" w:styleId="Normlntabulka">

</xml_diff>